<commit_message>
feat: Add standardized API response and error handling models with helper functions.
</commit_message>
<xml_diff>
--- a/Piano operativo v1.3.docx
+++ b/Piano operativo v1.3.docx
@@ -421,11 +421,13 @@
     <w:p>
       <w:pPr>
         <w:rPr>
-          <w:lang w:val="en-US"/>
-        </w:rPr>
-      </w:pPr>
-      <w:r>
-        <w:rPr>
+          <w:highlight w:val="yellow"/>
+          <w:lang w:val="en-US"/>
+        </w:rPr>
+      </w:pPr>
+      <w:r>
+        <w:rPr>
+          <w:highlight w:val="yellow"/>
           <w:lang w:val="en-US"/>
         </w:rPr>
         <w:t>**</w:t>
@@ -434,6 +436,7 @@
       <w:proofErr w:type="gramStart"/>
       <w:r>
         <w:rPr>
+          <w:highlight w:val="yellow"/>
           <w:lang w:val="en-US"/>
         </w:rPr>
         <w:t>Microstep</w:t>
@@ -441,6 +444,7 @@
       <w:proofErr w:type="spellEnd"/>
       <w:r>
         <w:rPr>
+          <w:highlight w:val="yellow"/>
           <w:lang w:val="en-US"/>
         </w:rPr>
         <w:t>:*</w:t>
@@ -448,6 +452,7 @@
       <w:proofErr w:type="gramEnd"/>
       <w:r>
         <w:rPr>
+          <w:highlight w:val="yellow"/>
           <w:lang w:val="en-US"/>
         </w:rPr>
         <w:t>*</w:t>
@@ -456,11 +461,13 @@
     <w:p>
       <w:pPr>
         <w:rPr>
-          <w:lang w:val="en-US"/>
-        </w:rPr>
-      </w:pPr>
-      <w:r>
-        <w:rPr>
+          <w:highlight w:val="yellow"/>
+          <w:lang w:val="en-US"/>
+        </w:rPr>
+      </w:pPr>
+      <w:r>
+        <w:rPr>
+          <w:highlight w:val="yellow"/>
           <w:lang w:val="en-US"/>
         </w:rPr>
         <w:t xml:space="preserve">1. </w:t>
@@ -468,6 +475,7 @@
       <w:proofErr w:type="spellStart"/>
       <w:r>
         <w:rPr>
+          <w:highlight w:val="yellow"/>
           <w:lang w:val="en-US"/>
         </w:rPr>
         <w:t>Creare</w:t>
@@ -475,6 +483,7 @@
       <w:proofErr w:type="spellEnd"/>
       <w:r>
         <w:rPr>
+          <w:highlight w:val="yellow"/>
           <w:lang w:val="en-US"/>
         </w:rPr>
         <w:t xml:space="preserve"> file `backend/</w:t>
@@ -482,6 +491,7 @@
       <w:proofErr w:type="spellStart"/>
       <w:r>
         <w:rPr>
+          <w:highlight w:val="yellow"/>
           <w:lang w:val="en-US"/>
         </w:rPr>
         <w:t>src</w:t>
@@ -489,233 +499,414 @@
       <w:proofErr w:type="spellEnd"/>
       <w:r>
         <w:rPr>
+          <w:highlight w:val="yellow"/>
           <w:lang w:val="en-US"/>
         </w:rPr>
         <w:t>/shared/schemas/api_response.py`</w:t>
       </w:r>
     </w:p>
     <w:p>
-      <w:r>
+      <w:pPr>
+        <w:rPr>
+          <w:highlight w:val="yellow"/>
+        </w:rPr>
+      </w:pPr>
+      <w:r>
+        <w:rPr>
+          <w:highlight w:val="yellow"/>
+        </w:rPr>
         <w:t>2. Definire schema `</w:t>
       </w:r>
       <w:proofErr w:type="spellStart"/>
       <w:r>
+        <w:rPr>
+          <w:highlight w:val="yellow"/>
+        </w:rPr>
         <w:t>ApiResponse</w:t>
       </w:r>
       <w:proofErr w:type="spellEnd"/>
       <w:r>
+        <w:rPr>
+          <w:highlight w:val="yellow"/>
+        </w:rPr>
         <w:t>` con campi: `success` (</w:t>
       </w:r>
       <w:proofErr w:type="spellStart"/>
       <w:r>
+        <w:rPr>
+          <w:highlight w:val="yellow"/>
+        </w:rPr>
         <w:t>bool</w:t>
       </w:r>
       <w:proofErr w:type="spellEnd"/>
       <w:r>
+        <w:rPr>
+          <w:highlight w:val="yellow"/>
+        </w:rPr>
         <w:t>), `data` (</w:t>
       </w:r>
       <w:proofErr w:type="spellStart"/>
       <w:r>
+        <w:rPr>
+          <w:highlight w:val="yellow"/>
+        </w:rPr>
         <w:t>generic</w:t>
       </w:r>
       <w:proofErr w:type="spellEnd"/>
       <w:r>
+        <w:rPr>
+          <w:highlight w:val="yellow"/>
+        </w:rPr>
         <w:t>/</w:t>
       </w:r>
       <w:proofErr w:type="spellStart"/>
       <w:r>
+        <w:rPr>
+          <w:highlight w:val="yellow"/>
+        </w:rPr>
         <w:t>nullable</w:t>
       </w:r>
       <w:proofErr w:type="spellEnd"/>
       <w:r>
+        <w:rPr>
+          <w:highlight w:val="yellow"/>
+        </w:rPr>
         <w:t>), `</w:t>
       </w:r>
       <w:proofErr w:type="spellStart"/>
       <w:r>
+        <w:rPr>
+          <w:highlight w:val="yellow"/>
+        </w:rPr>
         <w:t>error</w:t>
       </w:r>
       <w:proofErr w:type="spellEnd"/>
       <w:r>
+        <w:rPr>
+          <w:highlight w:val="yellow"/>
+        </w:rPr>
         <w:t>` (</w:t>
       </w:r>
       <w:proofErr w:type="spellStart"/>
       <w:r>
+        <w:rPr>
+          <w:highlight w:val="yellow"/>
+        </w:rPr>
         <w:t>nullable</w:t>
       </w:r>
       <w:proofErr w:type="spellEnd"/>
       <w:r>
+        <w:rPr>
+          <w:highlight w:val="yellow"/>
+        </w:rPr>
         <w:t>), `</w:t>
       </w:r>
       <w:proofErr w:type="spellStart"/>
       <w:r>
+        <w:rPr>
+          <w:highlight w:val="yellow"/>
+        </w:rPr>
         <w:t>trace_id</w:t>
       </w:r>
       <w:proofErr w:type="spellEnd"/>
       <w:r>
+        <w:rPr>
+          <w:highlight w:val="yellow"/>
+        </w:rPr>
         <w:t xml:space="preserve">` (UUID </w:t>
       </w:r>
       <w:proofErr w:type="spellStart"/>
       <w:r>
+        <w:rPr>
+          <w:highlight w:val="yellow"/>
+        </w:rPr>
         <w:t>string</w:t>
       </w:r>
       <w:proofErr w:type="spellEnd"/>
       <w:r>
+        <w:rPr>
+          <w:highlight w:val="yellow"/>
+        </w:rPr>
         <w:t>)</w:t>
       </w:r>
     </w:p>
     <w:p>
-      <w:r>
+      <w:pPr>
+        <w:rPr>
+          <w:highlight w:val="yellow"/>
+        </w:rPr>
+      </w:pPr>
+      <w:r>
+        <w:rPr>
+          <w:highlight w:val="yellow"/>
+        </w:rPr>
         <w:t>3. Definire schema `</w:t>
       </w:r>
       <w:proofErr w:type="spellStart"/>
       <w:r>
+        <w:rPr>
+          <w:highlight w:val="yellow"/>
+        </w:rPr>
         <w:t>ApiError</w:t>
       </w:r>
       <w:proofErr w:type="spellEnd"/>
       <w:r>
+        <w:rPr>
+          <w:highlight w:val="yellow"/>
+        </w:rPr>
         <w:t>` con campi: `code` (</w:t>
       </w:r>
       <w:proofErr w:type="spellStart"/>
       <w:r>
+        <w:rPr>
+          <w:highlight w:val="yellow"/>
+        </w:rPr>
         <w:t>string</w:t>
       </w:r>
       <w:proofErr w:type="spellEnd"/>
       <w:r>
+        <w:rPr>
+          <w:highlight w:val="yellow"/>
+        </w:rPr>
         <w:t>), `</w:t>
       </w:r>
       <w:proofErr w:type="spellStart"/>
       <w:r>
+        <w:rPr>
+          <w:highlight w:val="yellow"/>
+        </w:rPr>
         <w:t>message</w:t>
       </w:r>
       <w:proofErr w:type="spellEnd"/>
       <w:r>
+        <w:rPr>
+          <w:highlight w:val="yellow"/>
+        </w:rPr>
         <w:t>` (</w:t>
       </w:r>
       <w:proofErr w:type="spellStart"/>
       <w:r>
+        <w:rPr>
+          <w:highlight w:val="yellow"/>
+        </w:rPr>
         <w:t>string</w:t>
       </w:r>
       <w:proofErr w:type="spellEnd"/>
       <w:r>
+        <w:rPr>
+          <w:highlight w:val="yellow"/>
+        </w:rPr>
         <w:t>), `</w:t>
       </w:r>
       <w:proofErr w:type="spellStart"/>
       <w:r>
+        <w:rPr>
+          <w:highlight w:val="yellow"/>
+        </w:rPr>
         <w:t>details</w:t>
       </w:r>
       <w:proofErr w:type="spellEnd"/>
       <w:r>
+        <w:rPr>
+          <w:highlight w:val="yellow"/>
+        </w:rPr>
         <w:t xml:space="preserve">` (optional </w:t>
       </w:r>
       <w:proofErr w:type="spellStart"/>
       <w:r>
+        <w:rPr>
+          <w:highlight w:val="yellow"/>
+        </w:rPr>
         <w:t>dict</w:t>
       </w:r>
       <w:proofErr w:type="spellEnd"/>
       <w:r>
+        <w:rPr>
+          <w:highlight w:val="yellow"/>
+        </w:rPr>
         <w:t>)</w:t>
       </w:r>
     </w:p>
     <w:p>
-      <w:r>
+      <w:pPr>
+        <w:rPr>
+          <w:highlight w:val="yellow"/>
+        </w:rPr>
+      </w:pPr>
+      <w:r>
+        <w:rPr>
+          <w:highlight w:val="yellow"/>
+        </w:rPr>
         <w:t xml:space="preserve">4. Creare funzioni </w:t>
       </w:r>
       <w:proofErr w:type="spellStart"/>
       <w:r>
+        <w:rPr>
+          <w:highlight w:val="yellow"/>
+        </w:rPr>
         <w:t>helper</w:t>
       </w:r>
       <w:proofErr w:type="spellEnd"/>
       <w:r>
+        <w:rPr>
+          <w:highlight w:val="yellow"/>
+        </w:rPr>
         <w:t>: `</w:t>
       </w:r>
       <w:proofErr w:type="spellStart"/>
       <w:r>
+        <w:rPr>
+          <w:highlight w:val="yellow"/>
+        </w:rPr>
         <w:t>success_</w:t>
       </w:r>
       <w:proofErr w:type="gramStart"/>
       <w:r>
+        <w:rPr>
+          <w:highlight w:val="yellow"/>
+        </w:rPr>
         <w:t>response</w:t>
       </w:r>
       <w:proofErr w:type="spellEnd"/>
       <w:r>
+        <w:rPr>
+          <w:highlight w:val="yellow"/>
+        </w:rPr>
         <w:t>(</w:t>
       </w:r>
       <w:proofErr w:type="gramEnd"/>
       <w:r>
+        <w:rPr>
+          <w:highlight w:val="yellow"/>
+        </w:rPr>
         <w:t xml:space="preserve">data, </w:t>
       </w:r>
       <w:proofErr w:type="spellStart"/>
       <w:r>
+        <w:rPr>
+          <w:highlight w:val="yellow"/>
+        </w:rPr>
         <w:t>trace_</w:t>
       </w:r>
       <w:proofErr w:type="gramStart"/>
       <w:r>
+        <w:rPr>
+          <w:highlight w:val="yellow"/>
+        </w:rPr>
         <w:t>id</w:t>
       </w:r>
       <w:proofErr w:type="spellEnd"/>
       <w:r>
+        <w:rPr>
+          <w:highlight w:val="yellow"/>
+        </w:rPr>
         <w:t>)`</w:t>
       </w:r>
       <w:proofErr w:type="gramEnd"/>
       <w:r>
+        <w:rPr>
+          <w:highlight w:val="yellow"/>
+        </w:rPr>
         <w:t>, `</w:t>
       </w:r>
       <w:proofErr w:type="spellStart"/>
       <w:r>
+        <w:rPr>
+          <w:highlight w:val="yellow"/>
+        </w:rPr>
         <w:t>error_</w:t>
       </w:r>
       <w:proofErr w:type="gramStart"/>
       <w:r>
+        <w:rPr>
+          <w:highlight w:val="yellow"/>
+        </w:rPr>
         <w:t>response</w:t>
       </w:r>
       <w:proofErr w:type="spellEnd"/>
       <w:r>
+        <w:rPr>
+          <w:highlight w:val="yellow"/>
+        </w:rPr>
         <w:t>(</w:t>
       </w:r>
       <w:proofErr w:type="gramEnd"/>
       <w:r>
+        <w:rPr>
+          <w:highlight w:val="yellow"/>
+        </w:rPr>
         <w:t xml:space="preserve">code, </w:t>
       </w:r>
       <w:proofErr w:type="spellStart"/>
       <w:r>
+        <w:rPr>
+          <w:highlight w:val="yellow"/>
+        </w:rPr>
         <w:t>message</w:t>
       </w:r>
       <w:proofErr w:type="spellEnd"/>
       <w:r>
+        <w:rPr>
+          <w:highlight w:val="yellow"/>
+        </w:rPr>
         <w:t xml:space="preserve">, </w:t>
       </w:r>
       <w:proofErr w:type="spellStart"/>
       <w:r>
+        <w:rPr>
+          <w:highlight w:val="yellow"/>
+        </w:rPr>
         <w:t>details</w:t>
       </w:r>
       <w:proofErr w:type="spellEnd"/>
       <w:r>
+        <w:rPr>
+          <w:highlight w:val="yellow"/>
+        </w:rPr>
         <w:t xml:space="preserve">, </w:t>
       </w:r>
       <w:proofErr w:type="spellStart"/>
       <w:r>
+        <w:rPr>
+          <w:highlight w:val="yellow"/>
+        </w:rPr>
         <w:t>trace_</w:t>
       </w:r>
       <w:proofErr w:type="gramStart"/>
       <w:r>
+        <w:rPr>
+          <w:highlight w:val="yellow"/>
+        </w:rPr>
         <w:t>id</w:t>
       </w:r>
       <w:proofErr w:type="spellEnd"/>
       <w:r>
+        <w:rPr>
+          <w:highlight w:val="yellow"/>
+        </w:rPr>
         <w:t>)`</w:t>
       </w:r>
       <w:proofErr w:type="gramEnd"/>
     </w:p>
     <w:p>
       <w:r>
+        <w:rPr>
+          <w:highlight w:val="yellow"/>
+        </w:rPr>
         <w:t xml:space="preserve">5. Documentare con </w:t>
       </w:r>
       <w:proofErr w:type="spellStart"/>
       <w:r>
+        <w:rPr>
+          <w:highlight w:val="yellow"/>
+        </w:rPr>
         <w:t>docstring</w:t>
       </w:r>
       <w:proofErr w:type="spellEnd"/>
       <w:r>
+        <w:rPr>
+          <w:highlight w:val="yellow"/>
+        </w:rPr>
         <w:t xml:space="preserve"> l'uso previsto</w:t>
       </w:r>
     </w:p>
@@ -14334,15 +14525,7 @@
       </w:r>
     </w:p>
     <w:p>
-      <w:pPr>
-        <w:rPr>
-          <w:lang w:val="en-US"/>
-        </w:rPr>
-      </w:pPr>
-      <w:r>
-        <w:rPr>
-          <w:lang w:val="en-US"/>
-        </w:rPr>
+      <w:r>
         <w:t>---</w:t>
       </w:r>
     </w:p>
@@ -14351,14 +14534,12 @@
         <w:rPr>
           <w:b/>
           <w:bCs/>
-          <w:lang w:val="en-US"/>
         </w:rPr>
       </w:pPr>
       <w:r>
         <w:rPr>
           <w:b/>
           <w:bCs/>
-          <w:lang w:val="en-US"/>
         </w:rPr>
         <w:t>TASK 2.</w:t>
       </w:r>
@@ -14366,7 +14547,6 @@
         <w:rPr>
           <w:b/>
           <w:bCs/>
-          <w:lang w:val="en-US"/>
         </w:rPr>
         <w:t>19</w:t>
       </w:r>
@@ -14374,20 +14554,9 @@
         <w:rPr>
           <w:b/>
           <w:bCs/>
-          <w:lang w:val="en-US"/>
-        </w:rPr>
-        <w:t xml:space="preserve">: Caching &amp; Backoff per </w:t>
-      </w:r>
-      <w:proofErr w:type="spellStart"/>
-      <w:r>
-        <w:rPr>
-          <w:b/>
-          <w:bCs/>
-          <w:lang w:val="en-US"/>
-        </w:rPr>
-        <w:t>MarketDataProvider</w:t>
-      </w:r>
-      <w:proofErr w:type="spellEnd"/>
+        </w:rPr>
+        <w:t>: Caching &amp; Backoff per MarketDataProvider</w:t>
+      </w:r>
     </w:p>
     <w:p>
       <w:r>
@@ -21013,43 +21182,57 @@
       </w:r>
     </w:p>
     <w:p>
-      <w:r>
-        <w:t xml:space="preserve">   - Database: `SELECT 1`</w:t>
-      </w:r>
-    </w:p>
-    <w:p>
-      <w:r>
-        <w:t xml:space="preserve">   - </w:t>
-      </w:r>
-      <w:proofErr w:type="spellStart"/>
-      <w:r>
-        <w:t>Redis</w:t>
-      </w:r>
-      <w:proofErr w:type="spellEnd"/>
-      <w:r>
-        <w:t>: `PING`</w:t>
-      </w:r>
-    </w:p>
-    <w:p>
-      <w:r>
-        <w:t xml:space="preserve">   - Yahoo API: </w:t>
-      </w:r>
-      <w:proofErr w:type="spellStart"/>
-      <w:r>
-        <w:t>get</w:t>
-      </w:r>
-      <w:proofErr w:type="spellEnd"/>
-      <w:r>
-        <w:t xml:space="preserve"> price per AAPL (ticker sempre disponibile)</w:t>
-      </w:r>
-    </w:p>
-    <w:p>
-      <w:pPr>
-        <w:rPr>
-          <w:lang w:val="en-US"/>
-        </w:rPr>
-      </w:pPr>
-      <w:r>
+      <w:pPr>
+        <w:rPr>
+          <w:lang w:val="en-US"/>
+        </w:rPr>
+      </w:pPr>
+      <w:r>
+        <w:t xml:space="preserve">   </w:t>
+      </w:r>
+      <w:r>
+        <w:rPr>
+          <w:lang w:val="en-US"/>
+        </w:rPr>
+        <w:t>- Database: `SELECT 1`</w:t>
+      </w:r>
+    </w:p>
+    <w:p>
+      <w:pPr>
+        <w:rPr>
+          <w:lang w:val="en-US"/>
+        </w:rPr>
+      </w:pPr>
+      <w:r>
+        <w:rPr>
+          <w:lang w:val="en-US"/>
+        </w:rPr>
+        <w:t xml:space="preserve">   - Redis: `PING`</w:t>
+      </w:r>
+    </w:p>
+    <w:p>
+      <w:pPr>
+        <w:rPr>
+          <w:lang w:val="en-US"/>
+        </w:rPr>
+      </w:pPr>
+      <w:r>
+        <w:rPr>
+          <w:lang w:val="en-US"/>
+        </w:rPr>
+        <w:t xml:space="preserve">   - Yahoo API: get price per AAPL (ticker sempre disponibile)</w:t>
+      </w:r>
+    </w:p>
+    <w:p>
+      <w:pPr>
+        <w:rPr>
+          <w:lang w:val="en-US"/>
+        </w:rPr>
+      </w:pPr>
+      <w:r>
+        <w:rPr>
+          <w:lang w:val="en-US"/>
+        </w:rPr>
         <w:t xml:space="preserve">   </w:t>
       </w:r>
       <w:r>
@@ -30470,11 +30653,25 @@
     </w:p>
     <w:p/>
     <w:p>
-      <w:r>
+      <w:pPr>
+        <w:rPr>
+          <w:lang w:val="en-US"/>
+        </w:rPr>
+      </w:pPr>
+      <w:r>
+        <w:rPr>
+          <w:lang w:val="en-US"/>
+        </w:rPr>
         <w:t>---</w:t>
       </w:r>
     </w:p>
-    <w:p/>
+    <w:p>
+      <w:pPr>
+        <w:rPr>
+          <w:lang w:val="en-US"/>
+        </w:rPr>
+      </w:pPr>
+    </w:p>
     <w:p>
       <w:pPr>
         <w:rPr>

</xml_diff>

<commit_message>
feat: Implement generic API response and error models with helper functions.
</commit_message>
<xml_diff>
--- a/Piano operativo v1.3.docx
+++ b/Piano operativo v1.3.docx
@@ -48,101 +48,195 @@
     </w:p>
     <w:p/>
     <w:p>
-      <w:r>
+      <w:pPr>
+        <w:rPr>
+          <w:highlight w:val="green"/>
+        </w:rPr>
+      </w:pPr>
+      <w:r>
+        <w:rPr>
+          <w:highlight w:val="green"/>
+        </w:rPr>
         <w:t xml:space="preserve">## TASK 1.1: Setup Struttura Layer </w:t>
       </w:r>
       <w:proofErr w:type="spellStart"/>
       <w:r>
+        <w:rPr>
+          <w:highlight w:val="green"/>
+        </w:rPr>
         <w:t>Backend</w:t>
       </w:r>
       <w:proofErr w:type="spellEnd"/>
     </w:p>
-    <w:p/>
-    <w:p>
-      <w:r>
+    <w:p>
+      <w:pPr>
+        <w:rPr>
+          <w:highlight w:val="green"/>
+        </w:rPr>
+      </w:pPr>
+    </w:p>
+    <w:p>
+      <w:pPr>
+        <w:rPr>
+          <w:highlight w:val="green"/>
+        </w:rPr>
+      </w:pPr>
+      <w:r>
+        <w:rPr>
+          <w:highlight w:val="green"/>
+        </w:rPr>
         <w:t>**</w:t>
       </w:r>
       <w:proofErr w:type="gramStart"/>
       <w:r>
+        <w:rPr>
+          <w:highlight w:val="green"/>
+        </w:rPr>
         <w:t>Descrizione:*</w:t>
       </w:r>
       <w:proofErr w:type="gramEnd"/>
       <w:r>
+        <w:rPr>
+          <w:highlight w:val="green"/>
+        </w:rPr>
         <w:t xml:space="preserve">* Creare la struttura di cartelle e file base per il </w:t>
       </w:r>
       <w:proofErr w:type="spellStart"/>
       <w:r>
+        <w:rPr>
+          <w:highlight w:val="green"/>
+        </w:rPr>
         <w:t>layering</w:t>
       </w:r>
       <w:proofErr w:type="spellEnd"/>
       <w:r>
+        <w:rPr>
+          <w:highlight w:val="green"/>
+        </w:rPr>
         <w:t xml:space="preserve"> esplicito del </w:t>
       </w:r>
       <w:proofErr w:type="spellStart"/>
       <w:r>
+        <w:rPr>
+          <w:highlight w:val="green"/>
+        </w:rPr>
         <w:t>backend</w:t>
       </w:r>
       <w:proofErr w:type="spellEnd"/>
       <w:r>
+        <w:rPr>
+          <w:highlight w:val="green"/>
+        </w:rPr>
         <w:t xml:space="preserve"> </w:t>
       </w:r>
       <w:proofErr w:type="spellStart"/>
       <w:r>
+        <w:rPr>
+          <w:highlight w:val="green"/>
+        </w:rPr>
         <w:t>FastAPI</w:t>
       </w:r>
       <w:proofErr w:type="spellEnd"/>
       <w:r>
+        <w:rPr>
+          <w:highlight w:val="green"/>
+        </w:rPr>
         <w:t>.</w:t>
       </w:r>
     </w:p>
-    <w:p/>
-    <w:p>
-      <w:r>
+    <w:p>
+      <w:pPr>
+        <w:rPr>
+          <w:highlight w:val="green"/>
+        </w:rPr>
+      </w:pPr>
+    </w:p>
+    <w:p>
+      <w:pPr>
+        <w:rPr>
+          <w:highlight w:val="green"/>
+        </w:rPr>
+      </w:pPr>
+      <w:r>
+        <w:rPr>
+          <w:highlight w:val="green"/>
+        </w:rPr>
         <w:t>**</w:t>
       </w:r>
       <w:proofErr w:type="spellStart"/>
       <w:proofErr w:type="gramStart"/>
       <w:r>
+        <w:rPr>
+          <w:highlight w:val="green"/>
+        </w:rPr>
         <w:t>Microstep</w:t>
       </w:r>
       <w:proofErr w:type="spellEnd"/>
       <w:r>
+        <w:rPr>
+          <w:highlight w:val="green"/>
+        </w:rPr>
         <w:t>:*</w:t>
       </w:r>
       <w:proofErr w:type="gramEnd"/>
       <w:r>
+        <w:rPr>
+          <w:highlight w:val="green"/>
+        </w:rPr>
         <w:t>*</w:t>
       </w:r>
     </w:p>
     <w:p>
-      <w:r>
+      <w:pPr>
+        <w:rPr>
+          <w:highlight w:val="green"/>
+        </w:rPr>
+      </w:pPr>
+      <w:r>
+        <w:rPr>
+          <w:highlight w:val="green"/>
+        </w:rPr>
         <w:t>1. Creare cartella `</w:t>
       </w:r>
       <w:proofErr w:type="spellStart"/>
       <w:r>
+        <w:rPr>
+          <w:highlight w:val="green"/>
+        </w:rPr>
         <w:t>backend</w:t>
       </w:r>
       <w:proofErr w:type="spellEnd"/>
       <w:r>
+        <w:rPr>
+          <w:highlight w:val="green"/>
+        </w:rPr>
         <w:t>/</w:t>
       </w:r>
       <w:proofErr w:type="spellStart"/>
       <w:r>
+        <w:rPr>
+          <w:highlight w:val="green"/>
+        </w:rPr>
         <w:t>src</w:t>
       </w:r>
       <w:proofErr w:type="spellEnd"/>
       <w:r>
+        <w:rPr>
+          <w:highlight w:val="green"/>
+        </w:rPr>
         <w:t>/` come root del codice sorgente</w:t>
       </w:r>
     </w:p>
     <w:p>
       <w:pPr>
         <w:rPr>
-          <w:lang w:val="en-US"/>
-        </w:rPr>
-      </w:pPr>
-      <w:r>
-        <w:rPr>
+          <w:highlight w:val="green"/>
+          <w:lang w:val="en-US"/>
+        </w:rPr>
+      </w:pPr>
+      <w:r>
+        <w:rPr>
+          <w:highlight w:val="green"/>
           <w:lang w:val="en-US"/>
         </w:rPr>
         <w:t xml:space="preserve">2. </w:t>
@@ -150,6 +244,7 @@
       <w:proofErr w:type="spellStart"/>
       <w:r>
         <w:rPr>
+          <w:highlight w:val="green"/>
           <w:lang w:val="en-US"/>
         </w:rPr>
         <w:t>Creare</w:t>
@@ -157,6 +252,7 @@
       <w:proofErr w:type="spellEnd"/>
       <w:r>
         <w:rPr>
+          <w:highlight w:val="green"/>
           <w:lang w:val="en-US"/>
         </w:rPr>
         <w:t xml:space="preserve"> </w:t>
@@ -164,6 +260,7 @@
       <w:proofErr w:type="spellStart"/>
       <w:r>
         <w:rPr>
+          <w:highlight w:val="green"/>
           <w:lang w:val="en-US"/>
         </w:rPr>
         <w:t>sottocartelle</w:t>
@@ -171,6 +268,7 @@
       <w:proofErr w:type="spellEnd"/>
       <w:r>
         <w:rPr>
+          <w:highlight w:val="green"/>
           <w:lang w:val="en-US"/>
         </w:rPr>
         <w:t xml:space="preserve"> per ogni bounded context: `estimates/`, `</w:t>
@@ -178,6 +276,7 @@
       <w:proofErr w:type="spellStart"/>
       <w:r>
         <w:rPr>
+          <w:highlight w:val="green"/>
           <w:lang w:val="en-US"/>
         </w:rPr>
         <w:t>market_data</w:t>
@@ -185,201 +284,383 @@
       <w:proofErr w:type="spellEnd"/>
       <w:r>
         <w:rPr>
+          <w:highlight w:val="green"/>
           <w:lang w:val="en-US"/>
         </w:rPr>
         <w:t>/`, `sync/`, `analytics/`, `shared/`</w:t>
       </w:r>
     </w:p>
     <w:p>
-      <w:r>
+      <w:pPr>
+        <w:rPr>
+          <w:highlight w:val="green"/>
+        </w:rPr>
+      </w:pPr>
+      <w:r>
+        <w:rPr>
+          <w:highlight w:val="green"/>
+        </w:rPr>
         <w:t xml:space="preserve">3. Per ogni </w:t>
       </w:r>
       <w:proofErr w:type="spellStart"/>
       <w:r>
+        <w:rPr>
+          <w:highlight w:val="green"/>
+        </w:rPr>
         <w:t>bounded</w:t>
       </w:r>
       <w:proofErr w:type="spellEnd"/>
       <w:r>
+        <w:rPr>
+          <w:highlight w:val="green"/>
+        </w:rPr>
         <w:t xml:space="preserve"> </w:t>
       </w:r>
       <w:proofErr w:type="spellStart"/>
       <w:r>
+        <w:rPr>
+          <w:highlight w:val="green"/>
+        </w:rPr>
         <w:t>context</w:t>
       </w:r>
       <w:proofErr w:type="spellEnd"/>
       <w:r>
+        <w:rPr>
+          <w:highlight w:val="green"/>
+        </w:rPr>
         <w:t>, creare le sottocartelle: `api/`, `</w:t>
       </w:r>
       <w:proofErr w:type="spellStart"/>
       <w:r>
+        <w:rPr>
+          <w:highlight w:val="green"/>
+        </w:rPr>
         <w:t>schemas</w:t>
       </w:r>
       <w:proofErr w:type="spellEnd"/>
       <w:r>
+        <w:rPr>
+          <w:highlight w:val="green"/>
+        </w:rPr>
         <w:t>/`, `domain/`, `services/`, `repositories/`</w:t>
       </w:r>
     </w:p>
     <w:p>
-      <w:r>
+      <w:pPr>
+        <w:rPr>
+          <w:highlight w:val="green"/>
+        </w:rPr>
+      </w:pPr>
+      <w:r>
+        <w:rPr>
+          <w:highlight w:val="green"/>
+        </w:rPr>
         <w:t>4. Creare cartella `</w:t>
       </w:r>
       <w:proofErr w:type="spellStart"/>
       <w:r>
+        <w:rPr>
+          <w:highlight w:val="green"/>
+        </w:rPr>
         <w:t>backend</w:t>
       </w:r>
       <w:proofErr w:type="spellEnd"/>
       <w:r>
+        <w:rPr>
+          <w:highlight w:val="green"/>
+        </w:rPr>
         <w:t>/</w:t>
       </w:r>
       <w:proofErr w:type="spellStart"/>
       <w:r>
+        <w:rPr>
+          <w:highlight w:val="green"/>
+        </w:rPr>
         <w:t>src</w:t>
       </w:r>
       <w:proofErr w:type="spellEnd"/>
       <w:r>
+        <w:rPr>
+          <w:highlight w:val="green"/>
+        </w:rPr>
         <w:t>/infra/` con sottocartelle: `</w:t>
       </w:r>
       <w:proofErr w:type="spellStart"/>
       <w:r>
+        <w:rPr>
+          <w:highlight w:val="green"/>
+        </w:rPr>
         <w:t>yahoo</w:t>
       </w:r>
       <w:proofErr w:type="spellEnd"/>
       <w:r>
+        <w:rPr>
+          <w:highlight w:val="green"/>
+        </w:rPr>
         <w:t>/`, `drive/`, `cache/`, `</w:t>
       </w:r>
       <w:proofErr w:type="spellStart"/>
       <w:r>
+        <w:rPr>
+          <w:highlight w:val="green"/>
+        </w:rPr>
         <w:t>logging</w:t>
       </w:r>
       <w:proofErr w:type="spellEnd"/>
       <w:r>
+        <w:rPr>
+          <w:highlight w:val="green"/>
+        </w:rPr>
         <w:t>/`, `security/`</w:t>
       </w:r>
     </w:p>
     <w:p>
-      <w:r>
+      <w:pPr>
+        <w:rPr>
+          <w:highlight w:val="green"/>
+        </w:rPr>
+      </w:pPr>
+      <w:r>
+        <w:rPr>
+          <w:highlight w:val="green"/>
+        </w:rPr>
         <w:t>5. Creare file `__init__.py` in ogni cartella</w:t>
       </w:r>
     </w:p>
     <w:p>
-      <w:r>
+      <w:pPr>
+        <w:rPr>
+          <w:highlight w:val="green"/>
+        </w:rPr>
+      </w:pPr>
+      <w:r>
+        <w:rPr>
+          <w:highlight w:val="green"/>
+        </w:rPr>
         <w:t>6. Creare file `README.md` in `</w:t>
       </w:r>
       <w:proofErr w:type="spellStart"/>
       <w:r>
+        <w:rPr>
+          <w:highlight w:val="green"/>
+        </w:rPr>
         <w:t>backend</w:t>
       </w:r>
       <w:proofErr w:type="spellEnd"/>
       <w:r>
+        <w:rPr>
+          <w:highlight w:val="green"/>
+        </w:rPr>
         <w:t>/</w:t>
       </w:r>
       <w:proofErr w:type="spellStart"/>
       <w:r>
+        <w:rPr>
+          <w:highlight w:val="green"/>
+        </w:rPr>
         <w:t>src</w:t>
       </w:r>
       <w:proofErr w:type="spellEnd"/>
       <w:r>
+        <w:rPr>
+          <w:highlight w:val="green"/>
+        </w:rPr>
         <w:t xml:space="preserve">/` che documenta la convenzione di </w:t>
       </w:r>
       <w:proofErr w:type="spellStart"/>
       <w:r>
+        <w:rPr>
+          <w:highlight w:val="green"/>
+        </w:rPr>
         <w:t>layering</w:t>
       </w:r>
       <w:proofErr w:type="spellEnd"/>
     </w:p>
-    <w:p/>
-    <w:p>
-      <w:r>
+    <w:p>
+      <w:pPr>
+        <w:rPr>
+          <w:highlight w:val="green"/>
+        </w:rPr>
+      </w:pPr>
+    </w:p>
+    <w:p>
+      <w:pPr>
+        <w:rPr>
+          <w:highlight w:val="green"/>
+        </w:rPr>
+      </w:pPr>
+      <w:r>
+        <w:rPr>
+          <w:highlight w:val="green"/>
+        </w:rPr>
         <w:t>**</w:t>
       </w:r>
       <w:proofErr w:type="spellStart"/>
       <w:r>
+        <w:rPr>
+          <w:highlight w:val="green"/>
+        </w:rPr>
         <w:t>Acceptance</w:t>
       </w:r>
       <w:proofErr w:type="spellEnd"/>
       <w:r>
+        <w:rPr>
+          <w:highlight w:val="green"/>
+        </w:rPr>
         <w:t xml:space="preserve"> </w:t>
       </w:r>
       <w:proofErr w:type="spellStart"/>
       <w:proofErr w:type="gramStart"/>
       <w:r>
+        <w:rPr>
+          <w:highlight w:val="green"/>
+        </w:rPr>
         <w:t>Criteria</w:t>
       </w:r>
       <w:proofErr w:type="spellEnd"/>
       <w:r>
+        <w:rPr>
+          <w:highlight w:val="green"/>
+        </w:rPr>
         <w:t>:*</w:t>
       </w:r>
       <w:proofErr w:type="gramEnd"/>
       <w:r>
+        <w:rPr>
+          <w:highlight w:val="green"/>
+        </w:rPr>
         <w:t>*</w:t>
       </w:r>
     </w:p>
     <w:p>
-      <w:r>
+      <w:pPr>
+        <w:rPr>
+          <w:highlight w:val="green"/>
+        </w:rPr>
+      </w:pPr>
+      <w:r>
+        <w:rPr>
+          <w:highlight w:val="green"/>
+        </w:rPr>
         <w:t xml:space="preserve">- </w:t>
       </w:r>
       <w:proofErr w:type="gramStart"/>
       <w:r>
+        <w:rPr>
+          <w:highlight w:val="green"/>
+        </w:rPr>
         <w:t>[ ]</w:t>
       </w:r>
       <w:proofErr w:type="gramEnd"/>
       <w:r>
+        <w:rPr>
+          <w:highlight w:val="green"/>
+        </w:rPr>
         <w:t xml:space="preserve"> Struttura cartelle completa e navigabile</w:t>
       </w:r>
     </w:p>
     <w:p>
-      <w:r>
+      <w:pPr>
+        <w:rPr>
+          <w:highlight w:val="green"/>
+        </w:rPr>
+      </w:pPr>
+      <w:r>
+        <w:rPr>
+          <w:highlight w:val="green"/>
+        </w:rPr>
         <w:t xml:space="preserve">- </w:t>
       </w:r>
       <w:proofErr w:type="gramStart"/>
       <w:r>
+        <w:rPr>
+          <w:highlight w:val="green"/>
+        </w:rPr>
         <w:t>[ ]</w:t>
       </w:r>
       <w:proofErr w:type="gramEnd"/>
       <w:r>
+        <w:rPr>
+          <w:highlight w:val="green"/>
+        </w:rPr>
         <w:t xml:space="preserve"> Ogni cartella ha un `__init__.py`</w:t>
       </w:r>
     </w:p>
     <w:p>
-      <w:r>
+      <w:pPr>
+        <w:rPr>
+          <w:highlight w:val="green"/>
+        </w:rPr>
+      </w:pPr>
+      <w:r>
+        <w:rPr>
+          <w:highlight w:val="green"/>
+        </w:rPr>
         <w:t xml:space="preserve">- </w:t>
       </w:r>
       <w:proofErr w:type="gramStart"/>
       <w:r>
+        <w:rPr>
+          <w:highlight w:val="green"/>
+        </w:rPr>
         <w:t>[ ]</w:t>
       </w:r>
       <w:proofErr w:type="gramEnd"/>
       <w:r>
+        <w:rPr>
+          <w:highlight w:val="green"/>
+        </w:rPr>
         <w:t xml:space="preserve"> README documenta lo scopo di ogni </w:t>
       </w:r>
       <w:proofErr w:type="spellStart"/>
       <w:r>
+        <w:rPr>
+          <w:highlight w:val="green"/>
+        </w:rPr>
         <w:t>layer</w:t>
       </w:r>
       <w:proofErr w:type="spellEnd"/>
       <w:r>
+        <w:rPr>
+          <w:highlight w:val="green"/>
+        </w:rPr>
         <w:t xml:space="preserve"> (api, </w:t>
       </w:r>
       <w:proofErr w:type="spellStart"/>
       <w:r>
+        <w:rPr>
+          <w:highlight w:val="green"/>
+        </w:rPr>
         <w:t>schemas</w:t>
       </w:r>
       <w:proofErr w:type="spellEnd"/>
       <w:r>
+        <w:rPr>
+          <w:highlight w:val="green"/>
+        </w:rPr>
         <w:t>, domain, services, repositories, infra)</w:t>
       </w:r>
     </w:p>
     <w:p>
       <w:r>
+        <w:rPr>
+          <w:highlight w:val="green"/>
+        </w:rPr>
         <w:lastRenderedPageBreak/>
         <w:t xml:space="preserve">- </w:t>
       </w:r>
       <w:proofErr w:type="gramStart"/>
       <w:r>
+        <w:rPr>
+          <w:highlight w:val="green"/>
+        </w:rPr>
         <w:t>[ ]</w:t>
       </w:r>
       <w:proofErr w:type="gramEnd"/>
       <w:r>
+        <w:rPr>
+          <w:highlight w:val="green"/>
+        </w:rPr>
         <w:t xml:space="preserve"> Nessun file di logica ancora presente (solo struttura)</w:t>
       </w:r>
     </w:p>
@@ -391,43 +672,83 @@
     </w:p>
     <w:p/>
     <w:p>
-      <w:r>
+      <w:pPr>
+        <w:rPr>
+          <w:highlight w:val="green"/>
+        </w:rPr>
+      </w:pPr>
+      <w:r>
+        <w:rPr>
+          <w:highlight w:val="green"/>
+        </w:rPr>
         <w:t>## TASK 1.2: Definizione Modello Risposta API Standard</w:t>
       </w:r>
     </w:p>
-    <w:p/>
-    <w:p>
-      <w:r>
+    <w:p>
+      <w:pPr>
+        <w:rPr>
+          <w:highlight w:val="green"/>
+        </w:rPr>
+      </w:pPr>
+    </w:p>
+    <w:p>
+      <w:pPr>
+        <w:rPr>
+          <w:highlight w:val="green"/>
+        </w:rPr>
+      </w:pPr>
+      <w:r>
+        <w:rPr>
+          <w:highlight w:val="green"/>
+        </w:rPr>
         <w:t>**</w:t>
       </w:r>
       <w:proofErr w:type="gramStart"/>
       <w:r>
+        <w:rPr>
+          <w:highlight w:val="green"/>
+        </w:rPr>
         <w:t>Descrizione:*</w:t>
       </w:r>
       <w:proofErr w:type="gramEnd"/>
       <w:r>
+        <w:rPr>
+          <w:highlight w:val="green"/>
+        </w:rPr>
         <w:t xml:space="preserve">* Creare lo schema </w:t>
       </w:r>
       <w:proofErr w:type="spellStart"/>
       <w:r>
+        <w:rPr>
+          <w:highlight w:val="green"/>
+        </w:rPr>
         <w:t>Pydantic</w:t>
       </w:r>
       <w:proofErr w:type="spellEnd"/>
       <w:r>
+        <w:rPr>
+          <w:highlight w:val="green"/>
+        </w:rPr>
         <w:t xml:space="preserve"> per il modello di risposta API uniforme usato da tutti gli endpoint.</w:t>
       </w:r>
     </w:p>
-    <w:p/>
-    <w:p>
-      <w:pPr>
-        <w:rPr>
-          <w:highlight w:val="yellow"/>
-          <w:lang w:val="en-US"/>
-        </w:rPr>
-      </w:pPr>
-      <w:r>
-        <w:rPr>
-          <w:highlight w:val="yellow"/>
+    <w:p>
+      <w:pPr>
+        <w:rPr>
+          <w:highlight w:val="green"/>
+        </w:rPr>
+      </w:pPr>
+    </w:p>
+    <w:p>
+      <w:pPr>
+        <w:rPr>
+          <w:highlight w:val="green"/>
+          <w:lang w:val="en-US"/>
+        </w:rPr>
+      </w:pPr>
+      <w:r>
+        <w:rPr>
+          <w:highlight w:val="green"/>
           <w:lang w:val="en-US"/>
         </w:rPr>
         <w:t>**</w:t>
@@ -436,7 +757,7 @@
       <w:proofErr w:type="gramStart"/>
       <w:r>
         <w:rPr>
-          <w:highlight w:val="yellow"/>
+          <w:highlight w:val="green"/>
           <w:lang w:val="en-US"/>
         </w:rPr>
         <w:t>Microstep</w:t>
@@ -444,7 +765,7 @@
       <w:proofErr w:type="spellEnd"/>
       <w:r>
         <w:rPr>
-          <w:highlight w:val="yellow"/>
+          <w:highlight w:val="green"/>
           <w:lang w:val="en-US"/>
         </w:rPr>
         <w:t>:*</w:t>
@@ -452,7 +773,7 @@
       <w:proofErr w:type="gramEnd"/>
       <w:r>
         <w:rPr>
-          <w:highlight w:val="yellow"/>
+          <w:highlight w:val="green"/>
           <w:lang w:val="en-US"/>
         </w:rPr>
         <w:t>*</w:t>
@@ -461,13 +782,13 @@
     <w:p>
       <w:pPr>
         <w:rPr>
-          <w:highlight w:val="yellow"/>
-          <w:lang w:val="en-US"/>
-        </w:rPr>
-      </w:pPr>
-      <w:r>
-        <w:rPr>
-          <w:highlight w:val="yellow"/>
+          <w:highlight w:val="green"/>
+          <w:lang w:val="en-US"/>
+        </w:rPr>
+      </w:pPr>
+      <w:r>
+        <w:rPr>
+          <w:highlight w:val="green"/>
           <w:lang w:val="en-US"/>
         </w:rPr>
         <w:t xml:space="preserve">1. </w:t>
@@ -475,7 +796,7 @@
       <w:proofErr w:type="spellStart"/>
       <w:r>
         <w:rPr>
-          <w:highlight w:val="yellow"/>
+          <w:highlight w:val="green"/>
           <w:lang w:val="en-US"/>
         </w:rPr>
         <w:t>Creare</w:t>
@@ -483,7 +804,7 @@
       <w:proofErr w:type="spellEnd"/>
       <w:r>
         <w:rPr>
-          <w:highlight w:val="yellow"/>
+          <w:highlight w:val="green"/>
           <w:lang w:val="en-US"/>
         </w:rPr>
         <w:t xml:space="preserve"> file `backend/</w:t>
@@ -491,7 +812,7 @@
       <w:proofErr w:type="spellStart"/>
       <w:r>
         <w:rPr>
-          <w:highlight w:val="yellow"/>
+          <w:highlight w:val="green"/>
           <w:lang w:val="en-US"/>
         </w:rPr>
         <w:t>src</w:t>
@@ -499,7 +820,7 @@
       <w:proofErr w:type="spellEnd"/>
       <w:r>
         <w:rPr>
-          <w:highlight w:val="yellow"/>
+          <w:highlight w:val="green"/>
           <w:lang w:val="en-US"/>
         </w:rPr>
         <w:t>/shared/schemas/api_response.py`</w:t>
@@ -508,124 +829,124 @@
     <w:p>
       <w:pPr>
         <w:rPr>
-          <w:highlight w:val="yellow"/>
-        </w:rPr>
-      </w:pPr>
-      <w:r>
-        <w:rPr>
-          <w:highlight w:val="yellow"/>
+          <w:highlight w:val="green"/>
+        </w:rPr>
+      </w:pPr>
+      <w:r>
+        <w:rPr>
+          <w:highlight w:val="green"/>
         </w:rPr>
         <w:t>2. Definire schema `</w:t>
       </w:r>
       <w:proofErr w:type="spellStart"/>
       <w:r>
         <w:rPr>
-          <w:highlight w:val="yellow"/>
+          <w:highlight w:val="green"/>
         </w:rPr>
         <w:t>ApiResponse</w:t>
       </w:r>
       <w:proofErr w:type="spellEnd"/>
       <w:r>
         <w:rPr>
-          <w:highlight w:val="yellow"/>
+          <w:highlight w:val="green"/>
         </w:rPr>
         <w:t>` con campi: `success` (</w:t>
       </w:r>
       <w:proofErr w:type="spellStart"/>
       <w:r>
         <w:rPr>
-          <w:highlight w:val="yellow"/>
+          <w:highlight w:val="green"/>
         </w:rPr>
         <w:t>bool</w:t>
       </w:r>
       <w:proofErr w:type="spellEnd"/>
       <w:r>
         <w:rPr>
-          <w:highlight w:val="yellow"/>
+          <w:highlight w:val="green"/>
         </w:rPr>
         <w:t>), `data` (</w:t>
       </w:r>
       <w:proofErr w:type="spellStart"/>
       <w:r>
         <w:rPr>
-          <w:highlight w:val="yellow"/>
+          <w:highlight w:val="green"/>
         </w:rPr>
         <w:t>generic</w:t>
       </w:r>
       <w:proofErr w:type="spellEnd"/>
       <w:r>
         <w:rPr>
-          <w:highlight w:val="yellow"/>
+          <w:highlight w:val="green"/>
         </w:rPr>
         <w:t>/</w:t>
       </w:r>
       <w:proofErr w:type="spellStart"/>
       <w:r>
         <w:rPr>
-          <w:highlight w:val="yellow"/>
+          <w:highlight w:val="green"/>
         </w:rPr>
         <w:t>nullable</w:t>
       </w:r>
       <w:proofErr w:type="spellEnd"/>
       <w:r>
         <w:rPr>
-          <w:highlight w:val="yellow"/>
+          <w:highlight w:val="green"/>
         </w:rPr>
         <w:t>), `</w:t>
       </w:r>
       <w:proofErr w:type="spellStart"/>
       <w:r>
         <w:rPr>
-          <w:highlight w:val="yellow"/>
+          <w:highlight w:val="green"/>
         </w:rPr>
         <w:t>error</w:t>
       </w:r>
       <w:proofErr w:type="spellEnd"/>
       <w:r>
         <w:rPr>
-          <w:highlight w:val="yellow"/>
+          <w:highlight w:val="green"/>
         </w:rPr>
         <w:t>` (</w:t>
       </w:r>
       <w:proofErr w:type="spellStart"/>
       <w:r>
         <w:rPr>
-          <w:highlight w:val="yellow"/>
+          <w:highlight w:val="green"/>
         </w:rPr>
         <w:t>nullable</w:t>
       </w:r>
       <w:proofErr w:type="spellEnd"/>
       <w:r>
         <w:rPr>
-          <w:highlight w:val="yellow"/>
+          <w:highlight w:val="green"/>
         </w:rPr>
         <w:t>), `</w:t>
       </w:r>
       <w:proofErr w:type="spellStart"/>
       <w:r>
         <w:rPr>
-          <w:highlight w:val="yellow"/>
+          <w:highlight w:val="green"/>
         </w:rPr>
         <w:t>trace_id</w:t>
       </w:r>
       <w:proofErr w:type="spellEnd"/>
       <w:r>
         <w:rPr>
-          <w:highlight w:val="yellow"/>
+          <w:highlight w:val="green"/>
         </w:rPr>
         <w:t xml:space="preserve">` (UUID </w:t>
       </w:r>
       <w:proofErr w:type="spellStart"/>
       <w:r>
         <w:rPr>
-          <w:highlight w:val="yellow"/>
+          <w:highlight w:val="green"/>
         </w:rPr>
         <w:t>string</w:t>
       </w:r>
       <w:proofErr w:type="spellEnd"/>
       <w:r>
         <w:rPr>
-          <w:highlight w:val="yellow"/>
+          <w:highlight w:val="green"/>
         </w:rPr>
         <w:t>)</w:t>
       </w:r>
@@ -633,96 +954,96 @@
     <w:p>
       <w:pPr>
         <w:rPr>
-          <w:highlight w:val="yellow"/>
-        </w:rPr>
-      </w:pPr>
-      <w:r>
-        <w:rPr>
-          <w:highlight w:val="yellow"/>
+          <w:highlight w:val="green"/>
+        </w:rPr>
+      </w:pPr>
+      <w:r>
+        <w:rPr>
+          <w:highlight w:val="green"/>
         </w:rPr>
         <w:t>3. Definire schema `</w:t>
       </w:r>
       <w:proofErr w:type="spellStart"/>
       <w:r>
         <w:rPr>
-          <w:highlight w:val="yellow"/>
+          <w:highlight w:val="green"/>
         </w:rPr>
         <w:t>ApiError</w:t>
       </w:r>
       <w:proofErr w:type="spellEnd"/>
       <w:r>
         <w:rPr>
-          <w:highlight w:val="yellow"/>
+          <w:highlight w:val="green"/>
         </w:rPr>
         <w:t>` con campi: `code` (</w:t>
       </w:r>
       <w:proofErr w:type="spellStart"/>
       <w:r>
         <w:rPr>
-          <w:highlight w:val="yellow"/>
+          <w:highlight w:val="green"/>
         </w:rPr>
         <w:t>string</w:t>
       </w:r>
       <w:proofErr w:type="spellEnd"/>
       <w:r>
         <w:rPr>
-          <w:highlight w:val="yellow"/>
+          <w:highlight w:val="green"/>
         </w:rPr>
         <w:t>), `</w:t>
       </w:r>
       <w:proofErr w:type="spellStart"/>
       <w:r>
         <w:rPr>
-          <w:highlight w:val="yellow"/>
+          <w:highlight w:val="green"/>
         </w:rPr>
         <w:t>message</w:t>
       </w:r>
       <w:proofErr w:type="spellEnd"/>
       <w:r>
         <w:rPr>
-          <w:highlight w:val="yellow"/>
+          <w:highlight w:val="green"/>
         </w:rPr>
         <w:t>` (</w:t>
       </w:r>
       <w:proofErr w:type="spellStart"/>
       <w:r>
         <w:rPr>
-          <w:highlight w:val="yellow"/>
+          <w:highlight w:val="green"/>
         </w:rPr>
         <w:t>string</w:t>
       </w:r>
       <w:proofErr w:type="spellEnd"/>
       <w:r>
         <w:rPr>
-          <w:highlight w:val="yellow"/>
+          <w:highlight w:val="green"/>
         </w:rPr>
         <w:t>), `</w:t>
       </w:r>
       <w:proofErr w:type="spellStart"/>
       <w:r>
         <w:rPr>
-          <w:highlight w:val="yellow"/>
+          <w:highlight w:val="green"/>
         </w:rPr>
         <w:t>details</w:t>
       </w:r>
       <w:proofErr w:type="spellEnd"/>
       <w:r>
         <w:rPr>
-          <w:highlight w:val="yellow"/>
+          <w:highlight w:val="green"/>
         </w:rPr>
         <w:t xml:space="preserve">` (optional </w:t>
       </w:r>
       <w:proofErr w:type="spellStart"/>
       <w:r>
         <w:rPr>
-          <w:highlight w:val="yellow"/>
+          <w:highlight w:val="green"/>
         </w:rPr>
         <w:t>dict</w:t>
       </w:r>
       <w:proofErr w:type="spellEnd"/>
       <w:r>
         <w:rPr>
-          <w:highlight w:val="yellow"/>
+          <w:highlight w:val="green"/>
         </w:rPr>
         <w:t>)</w:t>
       </w:r>
@@ -730,343 +1051,493 @@
     <w:p>
       <w:pPr>
         <w:rPr>
-          <w:highlight w:val="yellow"/>
-        </w:rPr>
-      </w:pPr>
-      <w:r>
-        <w:rPr>
-          <w:highlight w:val="yellow"/>
+          <w:highlight w:val="green"/>
+        </w:rPr>
+      </w:pPr>
+      <w:r>
+        <w:rPr>
+          <w:highlight w:val="green"/>
         </w:rPr>
         <w:t xml:space="preserve">4. Creare funzioni </w:t>
       </w:r>
       <w:proofErr w:type="spellStart"/>
       <w:r>
         <w:rPr>
-          <w:highlight w:val="yellow"/>
+          <w:highlight w:val="green"/>
         </w:rPr>
         <w:t>helper</w:t>
       </w:r>
       <w:proofErr w:type="spellEnd"/>
       <w:r>
         <w:rPr>
-          <w:highlight w:val="yellow"/>
+          <w:highlight w:val="green"/>
         </w:rPr>
         <w:t>: `</w:t>
       </w:r>
       <w:proofErr w:type="spellStart"/>
       <w:r>
         <w:rPr>
-          <w:highlight w:val="yellow"/>
+          <w:highlight w:val="green"/>
         </w:rPr>
         <w:t>success_</w:t>
       </w:r>
       <w:proofErr w:type="gramStart"/>
       <w:r>
         <w:rPr>
-          <w:highlight w:val="yellow"/>
+          <w:highlight w:val="green"/>
         </w:rPr>
         <w:t>response</w:t>
       </w:r>
       <w:proofErr w:type="spellEnd"/>
       <w:r>
         <w:rPr>
-          <w:highlight w:val="yellow"/>
+          <w:highlight w:val="green"/>
         </w:rPr>
         <w:t>(</w:t>
       </w:r>
       <w:proofErr w:type="gramEnd"/>
       <w:r>
         <w:rPr>
-          <w:highlight w:val="yellow"/>
+          <w:highlight w:val="green"/>
         </w:rPr>
         <w:t xml:space="preserve">data, </w:t>
       </w:r>
       <w:proofErr w:type="spellStart"/>
       <w:r>
         <w:rPr>
-          <w:highlight w:val="yellow"/>
+          <w:highlight w:val="green"/>
         </w:rPr>
         <w:t>trace_</w:t>
       </w:r>
       <w:proofErr w:type="gramStart"/>
       <w:r>
         <w:rPr>
-          <w:highlight w:val="yellow"/>
+          <w:highlight w:val="green"/>
         </w:rPr>
         <w:t>id</w:t>
       </w:r>
       <w:proofErr w:type="spellEnd"/>
       <w:r>
         <w:rPr>
-          <w:highlight w:val="yellow"/>
+          <w:highlight w:val="green"/>
         </w:rPr>
         <w:t>)`</w:t>
       </w:r>
       <w:proofErr w:type="gramEnd"/>
       <w:r>
         <w:rPr>
-          <w:highlight w:val="yellow"/>
+          <w:highlight w:val="green"/>
         </w:rPr>
         <w:t>, `</w:t>
       </w:r>
       <w:proofErr w:type="spellStart"/>
       <w:r>
         <w:rPr>
-          <w:highlight w:val="yellow"/>
+          <w:highlight w:val="green"/>
         </w:rPr>
         <w:t>error_</w:t>
       </w:r>
       <w:proofErr w:type="gramStart"/>
       <w:r>
         <w:rPr>
-          <w:highlight w:val="yellow"/>
+          <w:highlight w:val="green"/>
         </w:rPr>
         <w:t>response</w:t>
       </w:r>
       <w:proofErr w:type="spellEnd"/>
       <w:r>
         <w:rPr>
-          <w:highlight w:val="yellow"/>
+          <w:highlight w:val="green"/>
         </w:rPr>
         <w:t>(</w:t>
       </w:r>
       <w:proofErr w:type="gramEnd"/>
       <w:r>
         <w:rPr>
-          <w:highlight w:val="yellow"/>
+          <w:highlight w:val="green"/>
         </w:rPr>
         <w:t xml:space="preserve">code, </w:t>
       </w:r>
       <w:proofErr w:type="spellStart"/>
       <w:r>
         <w:rPr>
-          <w:highlight w:val="yellow"/>
+          <w:highlight w:val="green"/>
         </w:rPr>
         <w:t>message</w:t>
       </w:r>
       <w:proofErr w:type="spellEnd"/>
       <w:r>
         <w:rPr>
-          <w:highlight w:val="yellow"/>
+          <w:highlight w:val="green"/>
         </w:rPr>
         <w:t xml:space="preserve">, </w:t>
       </w:r>
       <w:proofErr w:type="spellStart"/>
       <w:r>
         <w:rPr>
-          <w:highlight w:val="yellow"/>
+          <w:highlight w:val="green"/>
         </w:rPr>
         <w:t>details</w:t>
       </w:r>
       <w:proofErr w:type="spellEnd"/>
       <w:r>
         <w:rPr>
-          <w:highlight w:val="yellow"/>
+          <w:highlight w:val="green"/>
         </w:rPr>
         <w:t xml:space="preserve">, </w:t>
       </w:r>
       <w:proofErr w:type="spellStart"/>
       <w:r>
         <w:rPr>
-          <w:highlight w:val="yellow"/>
+          <w:highlight w:val="green"/>
         </w:rPr>
         <w:t>trace_</w:t>
       </w:r>
       <w:proofErr w:type="gramStart"/>
       <w:r>
         <w:rPr>
-          <w:highlight w:val="yellow"/>
+          <w:highlight w:val="green"/>
         </w:rPr>
         <w:t>id</w:t>
       </w:r>
       <w:proofErr w:type="spellEnd"/>
       <w:r>
         <w:rPr>
-          <w:highlight w:val="yellow"/>
+          <w:highlight w:val="green"/>
         </w:rPr>
         <w:t>)`</w:t>
       </w:r>
       <w:proofErr w:type="gramEnd"/>
     </w:p>
     <w:p>
-      <w:r>
-        <w:rPr>
-          <w:highlight w:val="yellow"/>
+      <w:pPr>
+        <w:rPr>
+          <w:highlight w:val="green"/>
+        </w:rPr>
+      </w:pPr>
+      <w:r>
+        <w:rPr>
+          <w:highlight w:val="green"/>
         </w:rPr>
         <w:t xml:space="preserve">5. Documentare con </w:t>
       </w:r>
       <w:proofErr w:type="spellStart"/>
       <w:r>
         <w:rPr>
-          <w:highlight w:val="yellow"/>
+          <w:highlight w:val="green"/>
         </w:rPr>
         <w:t>docstring</w:t>
       </w:r>
       <w:proofErr w:type="spellEnd"/>
       <w:r>
         <w:rPr>
-          <w:highlight w:val="yellow"/>
+          <w:highlight w:val="green"/>
         </w:rPr>
         <w:t xml:space="preserve"> l'uso previsto</w:t>
       </w:r>
     </w:p>
-    <w:p/>
-    <w:p>
-      <w:r>
+    <w:p>
+      <w:pPr>
+        <w:rPr>
+          <w:highlight w:val="green"/>
+        </w:rPr>
+      </w:pPr>
+    </w:p>
+    <w:p>
+      <w:pPr>
+        <w:rPr>
+          <w:highlight w:val="green"/>
+        </w:rPr>
+      </w:pPr>
+      <w:r>
+        <w:rPr>
+          <w:highlight w:val="green"/>
+        </w:rPr>
         <w:t>**</w:t>
       </w:r>
       <w:proofErr w:type="spellStart"/>
       <w:r>
+        <w:rPr>
+          <w:highlight w:val="green"/>
+        </w:rPr>
         <w:t>Acceptance</w:t>
       </w:r>
       <w:proofErr w:type="spellEnd"/>
       <w:r>
+        <w:rPr>
+          <w:highlight w:val="green"/>
+        </w:rPr>
         <w:t xml:space="preserve"> </w:t>
       </w:r>
       <w:proofErr w:type="spellStart"/>
       <w:proofErr w:type="gramStart"/>
       <w:r>
+        <w:rPr>
+          <w:highlight w:val="green"/>
+        </w:rPr>
         <w:t>Criteria</w:t>
       </w:r>
       <w:proofErr w:type="spellEnd"/>
       <w:r>
+        <w:rPr>
+          <w:highlight w:val="green"/>
+        </w:rPr>
         <w:t>:*</w:t>
       </w:r>
       <w:proofErr w:type="gramEnd"/>
       <w:r>
+        <w:rPr>
+          <w:highlight w:val="green"/>
+        </w:rPr>
         <w:t>*</w:t>
       </w:r>
     </w:p>
     <w:p>
-      <w:r>
+      <w:pPr>
+        <w:rPr>
+          <w:highlight w:val="green"/>
+        </w:rPr>
+      </w:pPr>
+      <w:r>
+        <w:rPr>
+          <w:highlight w:val="green"/>
+        </w:rPr>
         <w:t xml:space="preserve">- </w:t>
       </w:r>
       <w:proofErr w:type="gramStart"/>
       <w:r>
+        <w:rPr>
+          <w:highlight w:val="green"/>
+        </w:rPr>
         <w:t>[ ]</w:t>
       </w:r>
       <w:proofErr w:type="gramEnd"/>
       <w:r>
+        <w:rPr>
+          <w:highlight w:val="green"/>
+        </w:rPr>
         <w:t xml:space="preserve"> Schema `</w:t>
       </w:r>
       <w:proofErr w:type="spellStart"/>
       <w:r>
+        <w:rPr>
+          <w:highlight w:val="green"/>
+        </w:rPr>
         <w:t>ApiResponse</w:t>
       </w:r>
       <w:proofErr w:type="spellEnd"/>
       <w:r>
+        <w:rPr>
+          <w:highlight w:val="green"/>
+        </w:rPr>
         <w:t>` è generico e accetta qualsiasi tipo di `data`</w:t>
       </w:r>
     </w:p>
     <w:p>
-      <w:r>
+      <w:pPr>
+        <w:rPr>
+          <w:highlight w:val="green"/>
+        </w:rPr>
+      </w:pPr>
+      <w:r>
+        <w:rPr>
+          <w:highlight w:val="green"/>
+        </w:rPr>
         <w:t xml:space="preserve">- </w:t>
       </w:r>
       <w:proofErr w:type="gramStart"/>
       <w:r>
+        <w:rPr>
+          <w:highlight w:val="green"/>
+        </w:rPr>
         <w:t>[ ]</w:t>
       </w:r>
       <w:proofErr w:type="gramEnd"/>
       <w:r>
+        <w:rPr>
+          <w:highlight w:val="green"/>
+        </w:rPr>
         <w:t xml:space="preserve"> Schema `</w:t>
       </w:r>
       <w:proofErr w:type="spellStart"/>
       <w:r>
+        <w:rPr>
+          <w:highlight w:val="green"/>
+        </w:rPr>
         <w:t>ApiError</w:t>
       </w:r>
       <w:proofErr w:type="spellEnd"/>
       <w:r>
+        <w:rPr>
+          <w:highlight w:val="green"/>
+        </w:rPr>
         <w:t>` è annidabile in `</w:t>
       </w:r>
       <w:proofErr w:type="spellStart"/>
       <w:r>
+        <w:rPr>
+          <w:highlight w:val="green"/>
+        </w:rPr>
         <w:t>ApiResponse.error</w:t>
       </w:r>
       <w:proofErr w:type="spellEnd"/>
       <w:r>
+        <w:rPr>
+          <w:highlight w:val="green"/>
+        </w:rPr>
         <w:t>`</w:t>
       </w:r>
     </w:p>
     <w:p>
-      <w:r>
+      <w:pPr>
+        <w:rPr>
+          <w:highlight w:val="green"/>
+        </w:rPr>
+      </w:pPr>
+      <w:r>
+        <w:rPr>
+          <w:highlight w:val="green"/>
+        </w:rPr>
         <w:t xml:space="preserve">- </w:t>
       </w:r>
       <w:proofErr w:type="gramStart"/>
       <w:r>
+        <w:rPr>
+          <w:highlight w:val="green"/>
+        </w:rPr>
         <w:t>[ ]</w:t>
       </w:r>
       <w:proofErr w:type="gramEnd"/>
       <w:r>
+        <w:rPr>
+          <w:highlight w:val="green"/>
+        </w:rPr>
         <w:t xml:space="preserve"> Funzioni </w:t>
       </w:r>
       <w:proofErr w:type="spellStart"/>
       <w:r>
+        <w:rPr>
+          <w:highlight w:val="green"/>
+        </w:rPr>
         <w:t>helper</w:t>
       </w:r>
       <w:proofErr w:type="spellEnd"/>
       <w:r>
+        <w:rPr>
+          <w:highlight w:val="green"/>
+        </w:rPr>
         <w:t xml:space="preserve"> producono risposte conformi allo schema</w:t>
       </w:r>
     </w:p>
     <w:p>
-      <w:r>
+      <w:pPr>
+        <w:rPr>
+          <w:highlight w:val="green"/>
+        </w:rPr>
+      </w:pPr>
+      <w:r>
+        <w:rPr>
+          <w:highlight w:val="green"/>
+        </w:rPr>
         <w:t xml:space="preserve">- </w:t>
       </w:r>
       <w:proofErr w:type="gramStart"/>
       <w:r>
+        <w:rPr>
+          <w:highlight w:val="green"/>
+        </w:rPr>
         <w:t>[ ]</w:t>
       </w:r>
       <w:proofErr w:type="gramEnd"/>
       <w:r>
+        <w:rPr>
+          <w:highlight w:val="green"/>
+        </w:rPr>
         <w:t xml:space="preserve"> Tutti i campi hanno </w:t>
       </w:r>
       <w:proofErr w:type="spellStart"/>
       <w:r>
+        <w:rPr>
+          <w:highlight w:val="green"/>
+        </w:rPr>
         <w:t>type</w:t>
       </w:r>
       <w:proofErr w:type="spellEnd"/>
       <w:r>
+        <w:rPr>
+          <w:highlight w:val="green"/>
+        </w:rPr>
         <w:t xml:space="preserve"> </w:t>
       </w:r>
       <w:proofErr w:type="spellStart"/>
       <w:r>
+        <w:rPr>
+          <w:highlight w:val="green"/>
+        </w:rPr>
         <w:t>hints</w:t>
       </w:r>
       <w:proofErr w:type="spellEnd"/>
       <w:r>
+        <w:rPr>
+          <w:highlight w:val="green"/>
+        </w:rPr>
         <w:t xml:space="preserve"> corretti</w:t>
       </w:r>
     </w:p>
     <w:p>
       <w:r>
+        <w:rPr>
+          <w:highlight w:val="green"/>
+        </w:rPr>
         <w:t xml:space="preserve">- </w:t>
       </w:r>
       <w:proofErr w:type="gramStart"/>
       <w:r>
+        <w:rPr>
+          <w:highlight w:val="green"/>
+        </w:rPr>
         <w:t>[ ]</w:t>
       </w:r>
       <w:proofErr w:type="gramEnd"/>
       <w:r>
+        <w:rPr>
+          <w:highlight w:val="green"/>
+        </w:rPr>
         <w:t xml:space="preserve"> </w:t>
       </w:r>
       <w:proofErr w:type="spellStart"/>
       <w:r>
+        <w:rPr>
+          <w:highlight w:val="green"/>
+        </w:rPr>
         <w:t>Docstring</w:t>
       </w:r>
       <w:proofErr w:type="spellEnd"/>
       <w:r>
+        <w:rPr>
+          <w:highlight w:val="green"/>
+        </w:rPr>
         <w:t xml:space="preserve"> spiega quando usare success vs </w:t>
       </w:r>
       <w:proofErr w:type="spellStart"/>
       <w:r>
+        <w:rPr>
+          <w:highlight w:val="green"/>
+        </w:rPr>
         <w:t>error</w:t>
       </w:r>
       <w:proofErr w:type="spellEnd"/>
       <w:r>
+        <w:rPr>
+          <w:highlight w:val="green"/>
+        </w:rPr>
         <w:t xml:space="preserve"> </w:t>
       </w:r>
       <w:proofErr w:type="spellStart"/>
       <w:r>
+        <w:rPr>
+          <w:highlight w:val="green"/>
+        </w:rPr>
         <w:t>response</w:t>
       </w:r>
       <w:proofErr w:type="spellEnd"/>
@@ -14555,8 +15026,17 @@
           <w:b/>
           <w:bCs/>
         </w:rPr>
-        <w:t>: Caching &amp; Backoff per MarketDataProvider</w:t>
-      </w:r>
+        <w:t xml:space="preserve">: Caching &amp; Backoff per </w:t>
+      </w:r>
+      <w:proofErr w:type="spellStart"/>
+      <w:r>
+        <w:rPr>
+          <w:b/>
+          <w:bCs/>
+        </w:rPr>
+        <w:t>MarketDataProvider</w:t>
+      </w:r>
+      <w:proofErr w:type="spellEnd"/>
     </w:p>
     <w:p>
       <w:r>
@@ -21220,7 +21700,21 @@
         <w:rPr>
           <w:lang w:val="en-US"/>
         </w:rPr>
-        <w:t xml:space="preserve">   - Yahoo API: get price per AAPL (ticker sempre disponibile)</w:t>
+        <w:t xml:space="preserve">   - Yahoo API: get price per AAPL (ticker sempre </w:t>
+      </w:r>
+      <w:proofErr w:type="spellStart"/>
+      <w:r>
+        <w:rPr>
+          <w:lang w:val="en-US"/>
+        </w:rPr>
+        <w:t>disponibile</w:t>
+      </w:r>
+      <w:proofErr w:type="spellEnd"/>
+      <w:r>
+        <w:rPr>
+          <w:lang w:val="en-US"/>
+        </w:rPr>
+        <w:t>)</w:t>
       </w:r>
     </w:p>
     <w:p>
@@ -41709,7 +42203,6 @@
   <w:style w:type="character" w:default="1" w:styleId="Carpredefinitoparagrafo">
     <w:name w:val="Default Paragraph Font"/>
     <w:uiPriority w:val="1"/>
-    <w:semiHidden/>
     <w:unhideWhenUsed/>
   </w:style>
   <w:style w:type="table" w:default="1" w:styleId="Tabellanormale">

</xml_diff>